<commit_message>
Clean temporary files for final submission
</commit_message>
<xml_diff>
--- a/HealthFirstPIMS_Screenshots.docx
+++ b/HealthFirstPIMS_Screenshots.docx
@@ -52,6 +52,26 @@
     <w:p>
       <w:r>
         <w:lastRenderedPageBreak/>
+        <w:t xml:space="preserve">GITHUB </w:t>
+      </w:r>
+      <w:proofErr w:type="gramStart"/>
+      <w:r>
+        <w:t>LINK :</w:t>
+      </w:r>
+      <w:proofErr w:type="gramEnd"/>
+      <w:r>
+        <w:t xml:space="preserve"> </w:t>
+      </w:r>
+      <w:r>
+        <w:t>https://github.com/SethGov10/HealthFirstPIMS</w:t>
+      </w:r>
+    </w:p>
+    <w:p/>
+    <w:p/>
+    <w:p/>
+    <w:p/>
+    <w:p>
+      <w:r>
         <w:t>Login screen before entering credentials.</w:t>
       </w:r>
     </w:p>
@@ -109,6 +129,7 @@
         <w:rPr>
           <w:noProof/>
         </w:rPr>
+        <w:lastRenderedPageBreak/>
         <w:drawing>
           <wp:inline distT="0" distB="0" distL="0" distR="0" wp14:anchorId="1AB62B91" wp14:editId="59B2104C">
             <wp:extent cx="3838575" cy="3209925"/>
@@ -211,7 +232,6 @@
     <w:p/>
     <w:p>
       <w:r>
-        <w:lastRenderedPageBreak/>
         <w:t xml:space="preserve">POS with </w:t>
       </w:r>
       <w:r>

</xml_diff>